<commit_message>
shortening topic pitch, adding project propsal
</commit_message>
<xml_diff>
--- a/Topic Pitch.docx
+++ b/Topic Pitch.docx
@@ -4,8 +4,10 @@
   <w:body>
     <w:p>
       <w:pPr>
+        <w:spacing w:after="120"/>
         <w:jc w:val="center"/>
         <w:rPr>
+          <w:rFonts w:ascii="Arial" w:hAnsi="Arial" w:cs="Arial"/>
           <w:b/>
           <w:bCs/>
           <w:sz w:val="28"/>
@@ -15,30 +17,1536 @@
       </w:pPr>
       <w:r>
         <w:rPr>
+          <w:rFonts w:ascii="Arial" w:hAnsi="Arial" w:cs="Arial"/>
           <w:b/>
           <w:bCs/>
           <w:sz w:val="28"/>
           <w:szCs w:val="28"/>
           <w:lang w:val="en-GB"/>
         </w:rPr>
-        <w:t>Topic Pitch</w:t>
+        <w:t>An Investigation on Connections between Exercise and Physical and Mental Health</w:t>
+      </w:r>
+      <w:r>
+        <w:rPr>
+          <w:rFonts w:ascii="Arial" w:hAnsi="Arial" w:cs="Arial"/>
+          <w:b/>
+          <w:bCs/>
+          <w:sz w:val="28"/>
+          <w:szCs w:val="28"/>
+          <w:lang w:val="en-GB"/>
+        </w:rPr>
+        <w:t xml:space="preserve"> – Topic Pitch</w:t>
       </w:r>
     </w:p>
     <w:p>
       <w:pPr>
-        <w:rPr>
-          <w:lang w:val="en-GB"/>
-        </w:rPr>
-      </w:pPr>
+        <w:spacing w:after="0"/>
+        <w:rPr>
+          <w:rFonts w:ascii="Arial" w:hAnsi="Arial" w:cs="Arial"/>
+          <w:lang w:val="en-GB"/>
+        </w:rPr>
+      </w:pPr>
+      <w:r>
+        <w:rPr>
+          <w:rFonts w:ascii="Arial" w:hAnsi="Arial" w:cs="Arial"/>
+          <w:lang w:val="en-GB"/>
+        </w:rPr>
+        <w:t>This project is focused on investigating the links between activity level and various health markers.</w:t>
+      </w:r>
+    </w:p>
+    <w:p>
+      <w:pPr>
+        <w:spacing w:after="120"/>
+        <w:rPr>
+          <w:rFonts w:ascii="Arial" w:hAnsi="Arial" w:cs="Arial"/>
+          <w:lang w:val="en-GB"/>
+        </w:rPr>
+      </w:pPr>
+    </w:p>
+    <w:p>
+      <w:pPr>
+        <w:spacing w:after="0"/>
+        <w:rPr>
+          <w:rFonts w:ascii="Arial" w:hAnsi="Arial" w:cs="Arial"/>
+          <w:lang w:val="en-GB"/>
+        </w:rPr>
+      </w:pPr>
+      <w:r>
+        <w:rPr>
+          <w:rFonts w:ascii="Arial" w:hAnsi="Arial" w:cs="Arial"/>
+          <w:lang w:val="en-GB"/>
+        </w:rPr>
+        <w:t xml:space="preserve">This information will help people decide on building their personal work out routines, </w:t>
+      </w:r>
+      <w:r>
+        <w:rPr>
+          <w:rFonts w:ascii="Arial" w:hAnsi="Arial" w:cs="Arial"/>
+          <w:lang w:val="en-GB"/>
+        </w:rPr>
+        <w:t xml:space="preserve">using data to determine </w:t>
+      </w:r>
+      <w:r>
+        <w:rPr>
+          <w:rFonts w:ascii="Arial" w:hAnsi="Arial" w:cs="Arial"/>
+          <w:lang w:val="en-GB"/>
+        </w:rPr>
+        <w:t xml:space="preserve">which areas they can focus on. They can see which advertised routines might not have results that match up to what's promised. </w:t>
+      </w:r>
+      <w:r>
+        <w:rPr>
+          <w:rFonts w:ascii="Arial" w:hAnsi="Arial" w:cs="Arial"/>
+          <w:lang w:val="en-GB"/>
+        </w:rPr>
+        <w:t>This data can</w:t>
+      </w:r>
+      <w:r>
+        <w:rPr>
+          <w:rFonts w:ascii="Arial" w:hAnsi="Arial" w:cs="Arial"/>
+          <w:lang w:val="en-GB"/>
+        </w:rPr>
+        <w:t xml:space="preserve"> help people with mental </w:t>
+      </w:r>
+      <w:r>
+        <w:rPr>
+          <w:rFonts w:ascii="Arial" w:hAnsi="Arial" w:cs="Arial"/>
+          <w:lang w:val="en-GB"/>
+        </w:rPr>
+        <w:t>health-based</w:t>
+      </w:r>
+      <w:r>
+        <w:rPr>
+          <w:rFonts w:ascii="Arial" w:hAnsi="Arial" w:cs="Arial"/>
+          <w:lang w:val="en-GB"/>
+        </w:rPr>
+        <w:t xml:space="preserve"> activity. It also </w:t>
+      </w:r>
+      <w:r>
+        <w:rPr>
+          <w:rFonts w:ascii="Arial" w:hAnsi="Arial" w:cs="Arial"/>
+          <w:lang w:val="en-GB"/>
+        </w:rPr>
+        <w:t>better informs people of</w:t>
+      </w:r>
+      <w:r>
+        <w:rPr>
+          <w:rFonts w:ascii="Arial" w:hAnsi="Arial" w:cs="Arial"/>
+          <w:lang w:val="en-GB"/>
+        </w:rPr>
+        <w:t xml:space="preserve"> the timeline </w:t>
+      </w:r>
+      <w:r>
+        <w:rPr>
+          <w:rFonts w:ascii="Arial" w:hAnsi="Arial" w:cs="Arial"/>
+          <w:lang w:val="en-GB"/>
+        </w:rPr>
+        <w:t>to achieve</w:t>
+      </w:r>
+      <w:r>
+        <w:rPr>
+          <w:rFonts w:ascii="Arial" w:hAnsi="Arial" w:cs="Arial"/>
+          <w:lang w:val="en-GB"/>
+        </w:rPr>
+        <w:t xml:space="preserve"> </w:t>
+      </w:r>
+      <w:r>
+        <w:rPr>
+          <w:rFonts w:ascii="Arial" w:hAnsi="Arial" w:cs="Arial"/>
+          <w:lang w:val="en-GB"/>
+        </w:rPr>
+        <w:t>their</w:t>
+      </w:r>
+      <w:r>
+        <w:rPr>
+          <w:rFonts w:ascii="Arial" w:hAnsi="Arial" w:cs="Arial"/>
+          <w:lang w:val="en-GB"/>
+        </w:rPr>
+        <w:t xml:space="preserve"> goals, </w:t>
+      </w:r>
+      <w:r>
+        <w:rPr>
+          <w:rFonts w:ascii="Arial" w:hAnsi="Arial" w:cs="Arial"/>
+          <w:lang w:val="en-GB"/>
+        </w:rPr>
+        <w:t xml:space="preserve">so they don’t give up early. </w:t>
+      </w:r>
+      <w:r>
+        <w:rPr>
+          <w:rFonts w:ascii="Arial" w:hAnsi="Arial" w:cs="Arial"/>
+          <w:lang w:val="en-GB"/>
+        </w:rPr>
+        <w:t>Overall, t</w:t>
+      </w:r>
+      <w:r>
+        <w:rPr>
+          <w:rFonts w:ascii="Arial" w:hAnsi="Arial" w:cs="Arial"/>
+          <w:lang w:val="en-GB"/>
+        </w:rPr>
+        <w:t xml:space="preserve">his would help provide a </w:t>
+      </w:r>
+      <w:r>
+        <w:rPr>
+          <w:rFonts w:ascii="Arial" w:hAnsi="Arial" w:cs="Arial"/>
+          <w:lang w:val="en-GB"/>
+        </w:rPr>
+        <w:t>wide-reaching</w:t>
+      </w:r>
+      <w:r>
+        <w:rPr>
+          <w:rFonts w:ascii="Arial" w:hAnsi="Arial" w:cs="Arial"/>
+          <w:lang w:val="en-GB"/>
+        </w:rPr>
+        <w:t xml:space="preserve"> benefit to those looking to exercise or help others exercise, especially once we simplify the data for public consumption.</w:t>
+      </w:r>
+    </w:p>
+    <w:p>
+      <w:pPr>
+        <w:spacing w:after="120"/>
+        <w:rPr>
+          <w:rFonts w:ascii="Arial" w:hAnsi="Arial" w:cs="Arial"/>
+          <w:lang w:val="en-GB"/>
+        </w:rPr>
+      </w:pPr>
+    </w:p>
+    <w:p>
+      <w:pPr>
+        <w:spacing w:after="0"/>
+        <w:rPr>
+          <w:rFonts w:ascii="Arial" w:hAnsi="Arial" w:cs="Arial"/>
+          <w:b/>
+          <w:bCs/>
+          <w:lang w:val="en-GB"/>
+        </w:rPr>
+      </w:pPr>
+      <w:r>
+        <w:rPr>
+          <w:rFonts w:ascii="Arial" w:hAnsi="Arial" w:cs="Arial"/>
+          <w:b/>
+          <w:bCs/>
+          <w:lang w:val="en-GB"/>
+        </w:rPr>
+        <w:t>Questions we aim to answer</w:t>
+      </w:r>
+    </w:p>
+    <w:p>
+      <w:pPr>
+        <w:pStyle w:val="ListParagraph"/>
+        <w:numPr>
+          <w:ilvl w:val="0"/>
+          <w:numId w:val="4"/>
+        </w:numPr>
+        <w:spacing w:after="0"/>
+        <w:rPr>
+          <w:rFonts w:ascii="Arial" w:hAnsi="Arial" w:cs="Arial"/>
+          <w:lang w:val="en-GB"/>
+        </w:rPr>
+      </w:pPr>
+      <w:r>
+        <w:rPr>
+          <w:rFonts w:ascii="Arial" w:hAnsi="Arial" w:cs="Arial"/>
+          <w:lang w:val="en-GB"/>
+        </w:rPr>
+        <w:t>What are, if any, the impacts of exercise on the health of sedentary populations?</w:t>
+      </w:r>
+    </w:p>
+    <w:p>
+      <w:pPr>
+        <w:pStyle w:val="ListParagraph"/>
+        <w:numPr>
+          <w:ilvl w:val="0"/>
+          <w:numId w:val="4"/>
+        </w:numPr>
+        <w:spacing w:after="0"/>
+        <w:rPr>
+          <w:rFonts w:ascii="Arial" w:hAnsi="Arial" w:cs="Arial"/>
+          <w:lang w:val="en-GB"/>
+        </w:rPr>
+      </w:pPr>
+      <w:r>
+        <w:rPr>
+          <w:rFonts w:ascii="Arial" w:hAnsi="Arial" w:cs="Arial"/>
+          <w:lang w:val="en-GB"/>
+        </w:rPr>
+        <w:t>What are, if any, the impacts of exercise on mental health?</w:t>
+      </w:r>
+    </w:p>
+    <w:p>
+      <w:pPr>
+        <w:pStyle w:val="ListParagraph"/>
+        <w:numPr>
+          <w:ilvl w:val="0"/>
+          <w:numId w:val="4"/>
+        </w:numPr>
+        <w:spacing w:after="0"/>
+        <w:rPr>
+          <w:rFonts w:ascii="Arial" w:hAnsi="Arial" w:cs="Arial"/>
+          <w:lang w:val="en-GB"/>
+        </w:rPr>
+      </w:pPr>
+      <w:r>
+        <w:rPr>
+          <w:rFonts w:ascii="Arial" w:hAnsi="Arial" w:cs="Arial"/>
+          <w:lang w:val="en-GB"/>
+        </w:rPr>
+        <w:t>What is, if exists, the relationship between exercise amounts/ intensity and sleep quality?</w:t>
+      </w:r>
+    </w:p>
+    <w:p>
+      <w:pPr>
+        <w:spacing w:after="120"/>
+        <w:rPr>
+          <w:rFonts w:ascii="Arial" w:hAnsi="Arial" w:cs="Arial"/>
+          <w:lang w:val="en-GB"/>
+        </w:rPr>
+      </w:pPr>
+    </w:p>
+    <w:p>
+      <w:pPr>
+        <w:spacing w:after="0"/>
+        <w:rPr>
+          <w:rFonts w:ascii="Arial" w:hAnsi="Arial" w:cs="Arial"/>
+          <w:b/>
+          <w:bCs/>
+          <w:lang w:val="en-GB"/>
+        </w:rPr>
+      </w:pPr>
+      <w:r>
+        <w:rPr>
+          <w:rFonts w:ascii="Arial" w:hAnsi="Arial" w:cs="Arial"/>
+          <w:b/>
+          <w:bCs/>
+          <w:lang w:val="en-GB"/>
+        </w:rPr>
+        <w:t>Possible Data sources</w:t>
+      </w:r>
+    </w:p>
+    <w:p>
+      <w:pPr>
+        <w:pStyle w:val="ListParagraph"/>
+        <w:numPr>
+          <w:ilvl w:val="0"/>
+          <w:numId w:val="5"/>
+        </w:numPr>
+        <w:spacing w:after="0"/>
+        <w:rPr>
+          <w:rFonts w:ascii="Arial" w:hAnsi="Arial" w:cs="Arial"/>
+          <w:lang w:val="en-GB"/>
+        </w:rPr>
+      </w:pPr>
+      <w:r>
+        <w:rPr>
+          <w:rFonts w:ascii="Arial" w:hAnsi="Arial" w:cs="Arial"/>
+          <w:lang w:val="en-GB"/>
+        </w:rPr>
+        <w:t>The effect of exercise on cardiovascular disease risk factors in sedentary population: a systematic review and meta-analysis</w:t>
+      </w:r>
+    </w:p>
+    <w:p>
+      <w:pPr>
+        <w:pStyle w:val="ListParagraph"/>
+        <w:numPr>
+          <w:ilvl w:val="0"/>
+          <w:numId w:val="5"/>
+        </w:numPr>
+        <w:spacing w:after="0"/>
+        <w:rPr>
+          <w:rFonts w:ascii="Arial" w:hAnsi="Arial" w:cs="Arial"/>
+          <w:lang w:val="en-GB"/>
+        </w:rPr>
+      </w:pPr>
+      <w:r>
+        <w:rPr>
+          <w:rFonts w:ascii="Arial" w:hAnsi="Arial" w:cs="Arial"/>
+          <w:lang w:val="en-GB"/>
+        </w:rPr>
+        <w:t>Cost-effectiveness of health coaching and financial incentives to promote physical activity after total knee replacement - ScienceDirect</w:t>
+      </w:r>
+    </w:p>
+    <w:p>
+      <w:pPr>
+        <w:pStyle w:val="ListParagraph"/>
+        <w:numPr>
+          <w:ilvl w:val="0"/>
+          <w:numId w:val="5"/>
+        </w:numPr>
+        <w:spacing w:after="0"/>
+        <w:rPr>
+          <w:rFonts w:ascii="Arial" w:hAnsi="Arial" w:cs="Arial"/>
+          <w:lang w:val="en-GB"/>
+        </w:rPr>
+      </w:pPr>
+      <w:r>
+        <w:rPr>
+          <w:rFonts w:ascii="Arial" w:hAnsi="Arial" w:cs="Arial"/>
+          <w:lang w:val="en-GB"/>
+        </w:rPr>
+        <w:t>An international consensus on strategies for implementing physical activity in inpatient mental health services: A nominal group technique - ScienceDirect</w:t>
+      </w:r>
+    </w:p>
+    <w:p>
+      <w:pPr>
+        <w:pStyle w:val="ListParagraph"/>
+        <w:numPr>
+          <w:ilvl w:val="0"/>
+          <w:numId w:val="5"/>
+        </w:numPr>
+        <w:spacing w:after="0"/>
+        <w:rPr>
+          <w:rFonts w:ascii="Arial" w:hAnsi="Arial" w:cs="Arial"/>
+          <w:lang w:val="en-GB"/>
+        </w:rPr>
+      </w:pPr>
+      <w:r>
+        <w:rPr>
+          <w:rFonts w:ascii="Arial" w:hAnsi="Arial" w:cs="Arial"/>
+          <w:lang w:val="en-GB"/>
+        </w:rPr>
+        <w:t>Mental health and sleep quality across different physical activity intensities: A cross-sectional epidemiological analysis - ScienceDirect</w:t>
+      </w:r>
+    </w:p>
+    <w:p>
+      <w:pPr>
+        <w:pStyle w:val="ListParagraph"/>
+        <w:numPr>
+          <w:ilvl w:val="0"/>
+          <w:numId w:val="5"/>
+        </w:numPr>
+        <w:spacing w:after="0"/>
+        <w:rPr>
+          <w:rFonts w:ascii="Arial" w:hAnsi="Arial" w:cs="Arial"/>
+          <w:lang w:val="en-GB"/>
+        </w:rPr>
+      </w:pPr>
+      <w:r>
+        <w:rPr>
+          <w:rFonts w:ascii="Arial" w:hAnsi="Arial" w:cs="Arial"/>
+          <w:lang w:val="en-GB"/>
+        </w:rPr>
+        <w:t xml:space="preserve">Interplay between physical activity volume and intensity with </w:t>
+      </w:r>
+      <w:r>
+        <w:rPr>
+          <w:rFonts w:ascii="Arial" w:hAnsi="Arial" w:cs="Arial"/>
+          <w:lang w:val="en-GB"/>
+        </w:rPr>
+        <w:t>modelled</w:t>
+      </w:r>
+      <w:r>
+        <w:rPr>
+          <w:rFonts w:ascii="Arial" w:hAnsi="Arial" w:cs="Arial"/>
+          <w:lang w:val="en-GB"/>
+        </w:rPr>
+        <w:t xml:space="preserve"> life expectancy in women and men: A prospective cohort analysis - ScienceDirect</w:t>
+      </w:r>
+    </w:p>
+    <w:p>
+      <w:pPr>
+        <w:spacing w:after="120"/>
+        <w:rPr>
+          <w:rFonts w:ascii="Arial" w:hAnsi="Arial" w:cs="Arial"/>
+          <w:lang w:val="en-GB"/>
+        </w:rPr>
+      </w:pPr>
+    </w:p>
+    <w:p>
+      <w:pPr>
+        <w:spacing w:after="0"/>
+        <w:rPr>
+          <w:rFonts w:ascii="Arial" w:hAnsi="Arial" w:cs="Arial"/>
+          <w:b/>
+          <w:bCs/>
+          <w:lang w:val="en-GB"/>
+        </w:rPr>
+      </w:pPr>
+      <w:r>
+        <w:rPr>
+          <w:rFonts w:ascii="Arial" w:hAnsi="Arial" w:cs="Arial"/>
+          <w:b/>
+          <w:bCs/>
+          <w:lang w:val="en-GB"/>
+        </w:rPr>
+        <w:t>Potential stakeholders:</w:t>
+      </w:r>
+    </w:p>
+    <w:p>
+      <w:pPr>
+        <w:pStyle w:val="ListParagraph"/>
+        <w:numPr>
+          <w:ilvl w:val="0"/>
+          <w:numId w:val="6"/>
+        </w:numPr>
+        <w:spacing w:after="0"/>
+        <w:rPr>
+          <w:rFonts w:ascii="Arial" w:hAnsi="Arial" w:cs="Arial"/>
+          <w:lang w:val="en-GB"/>
+        </w:rPr>
+      </w:pPr>
+      <w:r>
+        <w:rPr>
+          <w:rFonts w:ascii="Arial" w:hAnsi="Arial" w:cs="Arial"/>
+          <w:lang w:val="en-GB"/>
+        </w:rPr>
+        <w:t xml:space="preserve">Public health organisations </w:t>
+      </w:r>
+      <w:r>
+        <w:rPr>
+          <w:rFonts w:ascii="Arial" w:hAnsi="Arial" w:cs="Arial"/>
+          <w:lang w:val="en-GB"/>
+        </w:rPr>
+        <w:t>–</w:t>
+      </w:r>
+      <w:r>
+        <w:rPr>
+          <w:rFonts w:ascii="Arial" w:hAnsi="Arial" w:cs="Arial"/>
+          <w:lang w:val="en-GB"/>
+        </w:rPr>
+        <w:t xml:space="preserve"> </w:t>
+      </w:r>
+      <w:r>
+        <w:rPr>
+          <w:rFonts w:ascii="Arial" w:hAnsi="Arial" w:cs="Arial"/>
+          <w:lang w:val="en-GB"/>
+        </w:rPr>
+        <w:t>They may have</w:t>
+      </w:r>
+      <w:r>
+        <w:rPr>
+          <w:rFonts w:ascii="Arial" w:hAnsi="Arial" w:cs="Arial"/>
+          <w:lang w:val="en-GB"/>
+        </w:rPr>
+        <w:t xml:space="preserve"> an interest in encouraging physical activity.</w:t>
+      </w:r>
+    </w:p>
+    <w:p>
+      <w:pPr>
+        <w:pStyle w:val="ListParagraph"/>
+        <w:numPr>
+          <w:ilvl w:val="0"/>
+          <w:numId w:val="6"/>
+        </w:numPr>
+        <w:spacing w:after="0"/>
+        <w:rPr>
+          <w:rFonts w:ascii="Arial" w:hAnsi="Arial" w:cs="Arial"/>
+          <w:lang w:val="en-GB"/>
+        </w:rPr>
+      </w:pPr>
+      <w:r>
+        <w:rPr>
+          <w:rFonts w:ascii="Arial" w:hAnsi="Arial" w:cs="Arial"/>
+          <w:lang w:val="en-GB"/>
+        </w:rPr>
+        <w:t>Healthcare professionals - Mainly fields such as physiotherapy</w:t>
+      </w:r>
+      <w:r>
+        <w:rPr>
+          <w:rFonts w:ascii="Arial" w:hAnsi="Arial" w:cs="Arial"/>
+          <w:lang w:val="en-GB"/>
+        </w:rPr>
+        <w:t>, but also</w:t>
+      </w:r>
+      <w:r>
+        <w:rPr>
+          <w:rFonts w:ascii="Arial" w:hAnsi="Arial" w:cs="Arial"/>
+          <w:lang w:val="en-GB"/>
+        </w:rPr>
+        <w:t xml:space="preserve"> other general healthcare professions.</w:t>
+      </w:r>
+    </w:p>
+    <w:p>
+      <w:pPr>
+        <w:pStyle w:val="ListParagraph"/>
+        <w:numPr>
+          <w:ilvl w:val="0"/>
+          <w:numId w:val="6"/>
+        </w:numPr>
+        <w:spacing w:after="0"/>
+        <w:rPr>
+          <w:rFonts w:ascii="Arial" w:hAnsi="Arial" w:cs="Arial"/>
+          <w:lang w:val="en-GB"/>
+        </w:rPr>
+      </w:pPr>
+      <w:r>
+        <w:rPr>
+          <w:rFonts w:ascii="Arial" w:hAnsi="Arial" w:cs="Arial"/>
+          <w:lang w:val="en-GB"/>
+        </w:rPr>
+        <w:t>General public - Anyone from the physically infirm/inactive to those who exercise regularly would benefit from being more highly informed on clear and specific benefits of exercise.</w:t>
+      </w:r>
+    </w:p>
+    <w:p>
+      <w:pPr>
+        <w:pStyle w:val="ListParagraph"/>
+        <w:numPr>
+          <w:ilvl w:val="0"/>
+          <w:numId w:val="6"/>
+        </w:numPr>
+        <w:spacing w:after="0"/>
+        <w:rPr>
+          <w:rFonts w:ascii="Arial" w:hAnsi="Arial" w:cs="Arial"/>
+          <w:lang w:val="en-GB"/>
+        </w:rPr>
+      </w:pPr>
+      <w:r>
+        <w:rPr>
+          <w:rFonts w:ascii="Arial" w:hAnsi="Arial" w:cs="Arial"/>
+          <w:lang w:val="en-GB"/>
+        </w:rPr>
+        <w:t>Educational institutes - Schools and Universities tend to have Physical Education classes or sports-related degrees which link strongly to this study.</w:t>
+      </w:r>
+    </w:p>
+    <w:p>
+      <w:pPr>
+        <w:pStyle w:val="ListParagraph"/>
+        <w:numPr>
+          <w:ilvl w:val="0"/>
+          <w:numId w:val="6"/>
+        </w:numPr>
+        <w:spacing w:after="0"/>
+        <w:rPr>
+          <w:rFonts w:ascii="Arial" w:hAnsi="Arial" w:cs="Arial"/>
+          <w:lang w:val="en-GB"/>
+        </w:rPr>
+      </w:pPr>
+      <w:r>
+        <w:rPr>
+          <w:rFonts w:ascii="Arial" w:hAnsi="Arial" w:cs="Arial"/>
+          <w:lang w:val="en-GB"/>
+        </w:rPr>
+        <w:t xml:space="preserve">Organised sports - Organised events and organisations </w:t>
+      </w:r>
+      <w:r>
+        <w:rPr>
+          <w:rFonts w:ascii="Arial" w:hAnsi="Arial" w:cs="Arial"/>
+          <w:lang w:val="en-GB"/>
+        </w:rPr>
+        <w:t>would value this data</w:t>
+      </w:r>
+      <w:r>
+        <w:rPr>
+          <w:rFonts w:ascii="Arial" w:hAnsi="Arial" w:cs="Arial"/>
+          <w:lang w:val="en-GB"/>
+        </w:rPr>
+        <w:t xml:space="preserve">. </w:t>
+      </w:r>
+    </w:p>
+    <w:p>
+      <w:pPr>
+        <w:pStyle w:val="ListParagraph"/>
+        <w:numPr>
+          <w:ilvl w:val="0"/>
+          <w:numId w:val="6"/>
+        </w:numPr>
+        <w:spacing w:after="0"/>
+        <w:rPr>
+          <w:rFonts w:ascii="Arial" w:hAnsi="Arial" w:cs="Arial"/>
+          <w:lang w:val="en-GB"/>
+        </w:rPr>
+      </w:pPr>
+      <w:r>
+        <w:rPr>
+          <w:rFonts w:ascii="Arial" w:hAnsi="Arial" w:cs="Arial"/>
+          <w:lang w:val="en-GB"/>
+        </w:rPr>
+        <w:t xml:space="preserve">Personal trainers - The relevant data may aid in </w:t>
+      </w:r>
+      <w:r>
+        <w:rPr>
+          <w:rFonts w:ascii="Arial" w:hAnsi="Arial" w:cs="Arial"/>
+          <w:lang w:val="en-GB"/>
+        </w:rPr>
+        <w:t>creating</w:t>
+      </w:r>
+      <w:r>
+        <w:rPr>
+          <w:rFonts w:ascii="Arial" w:hAnsi="Arial" w:cs="Arial"/>
+          <w:lang w:val="en-GB"/>
+        </w:rPr>
+        <w:t xml:space="preserve"> their plans for their clients.</w:t>
+      </w:r>
+    </w:p>
+    <w:p>
+      <w:pPr>
+        <w:pStyle w:val="ListParagraph"/>
+        <w:numPr>
+          <w:ilvl w:val="0"/>
+          <w:numId w:val="6"/>
+        </w:numPr>
+        <w:spacing w:after="0"/>
+        <w:rPr>
+          <w:rFonts w:ascii="Arial" w:hAnsi="Arial" w:cs="Arial"/>
+          <w:lang w:val="en-GB"/>
+        </w:rPr>
+      </w:pPr>
+      <w:r>
+        <w:rPr>
+          <w:rFonts w:ascii="Arial" w:hAnsi="Arial" w:cs="Arial"/>
+          <w:lang w:val="en-GB"/>
+        </w:rPr>
+        <w:t xml:space="preserve">Government - May inform which types of public sports facilities a governing body </w:t>
+      </w:r>
+      <w:r>
+        <w:rPr>
+          <w:rFonts w:ascii="Arial" w:hAnsi="Arial" w:cs="Arial"/>
+          <w:lang w:val="en-GB"/>
+        </w:rPr>
+        <w:t>should</w:t>
+      </w:r>
+      <w:r>
+        <w:rPr>
+          <w:rFonts w:ascii="Arial" w:hAnsi="Arial" w:cs="Arial"/>
+          <w:lang w:val="en-GB"/>
+        </w:rPr>
+        <w:t xml:space="preserve"> invest in the construction of.</w:t>
+      </w:r>
+    </w:p>
+    <w:p>
+      <w:pPr>
+        <w:spacing w:after="120"/>
+        <w:rPr>
+          <w:rFonts w:ascii="Arial" w:hAnsi="Arial" w:cs="Arial"/>
+          <w:lang w:val="en-GB"/>
+        </w:rPr>
+      </w:pPr>
+    </w:p>
+    <w:p>
+      <w:pPr>
+        <w:spacing w:after="0"/>
+        <w:rPr>
+          <w:rFonts w:ascii="Arial" w:hAnsi="Arial" w:cs="Arial"/>
+          <w:lang w:val="en-GB"/>
+        </w:rPr>
+      </w:pPr>
+      <w:r>
+        <w:rPr>
+          <w:rFonts w:ascii="Arial" w:hAnsi="Arial" w:cs="Arial"/>
+          <w:lang w:val="en-GB"/>
+        </w:rPr>
+        <w:t xml:space="preserve">It is common knowledge that regular activity has some positive benefits. However, it </w:t>
+      </w:r>
+      <w:r>
+        <w:rPr>
+          <w:rFonts w:ascii="Arial" w:hAnsi="Arial" w:cs="Arial"/>
+          <w:lang w:val="en-GB"/>
+        </w:rPr>
+        <w:t>seems</w:t>
+      </w:r>
+      <w:r>
+        <w:rPr>
+          <w:rFonts w:ascii="Arial" w:hAnsi="Arial" w:cs="Arial"/>
+          <w:lang w:val="en-GB"/>
+        </w:rPr>
+        <w:t xml:space="preserve"> as if it is such an accepted stance that </w:t>
+      </w:r>
+      <w:r>
+        <w:rPr>
+          <w:rFonts w:ascii="Arial" w:hAnsi="Arial" w:cs="Arial"/>
+          <w:lang w:val="en-GB"/>
+        </w:rPr>
+        <w:t>much of</w:t>
+      </w:r>
+      <w:r>
+        <w:rPr>
+          <w:rFonts w:ascii="Arial" w:hAnsi="Arial" w:cs="Arial"/>
+          <w:lang w:val="en-GB"/>
+        </w:rPr>
+        <w:t xml:space="preserve"> the population doesn’t </w:t>
+      </w:r>
+      <w:r>
+        <w:rPr>
+          <w:rFonts w:ascii="Arial" w:hAnsi="Arial" w:cs="Arial"/>
+          <w:lang w:val="en-GB"/>
+        </w:rPr>
+        <w:t xml:space="preserve">truly understand </w:t>
+      </w:r>
+      <w:r>
+        <w:rPr>
+          <w:rFonts w:ascii="Arial" w:hAnsi="Arial" w:cs="Arial"/>
+          <w:lang w:val="en-GB"/>
+        </w:rPr>
+        <w:t>the</w:t>
+      </w:r>
+      <w:r>
+        <w:rPr>
+          <w:rFonts w:ascii="Arial" w:hAnsi="Arial" w:cs="Arial"/>
+          <w:lang w:val="en-GB"/>
+        </w:rPr>
+        <w:t xml:space="preserve"> impacts. </w:t>
+      </w:r>
+      <w:r>
+        <w:rPr>
+          <w:rFonts w:ascii="Arial" w:hAnsi="Arial" w:cs="Arial"/>
+          <w:lang w:val="en-GB"/>
+        </w:rPr>
+        <w:t xml:space="preserve">A digestible visualisation of data is oftentimes more impactful than plain data and information. We aim to make the information we have gathered more readable to the </w:t>
+      </w:r>
+      <w:r>
+        <w:rPr>
+          <w:rFonts w:ascii="Arial" w:hAnsi="Arial" w:cs="Arial"/>
+          <w:lang w:val="en-GB"/>
+        </w:rPr>
+        <w:t>public</w:t>
+      </w:r>
+      <w:r>
+        <w:rPr>
+          <w:rFonts w:ascii="Arial" w:hAnsi="Arial" w:cs="Arial"/>
+          <w:lang w:val="en-GB"/>
+        </w:rPr>
+        <w:t>.</w:t>
+      </w:r>
     </w:p>
     <w:sectPr>
       <w:pgSz w:w="11906" w:h="16838"/>
-      <w:pgMar w:top="1440" w:right="1440" w:bottom="1440" w:left="1440" w:header="708" w:footer="708" w:gutter="0"/>
+      <w:pgMar w:top="720" w:right="720" w:bottom="720" w:left="720" w:header="708" w:footer="708" w:gutter="0"/>
       <w:cols w:space="708"/>
       <w:docGrid w:linePitch="360"/>
     </w:sectPr>
   </w:body>
 </w:document>
+</file>
+
+<file path=word/numbering.xml><?xml version="1.0" encoding="utf-8"?>
+<w:numbering xmlns:wpc="http://schemas.microsoft.com/office/word/2010/wordprocessingCanvas" xmlns:cx="http://schemas.microsoft.com/office/drawing/2014/chartex" xmlns:cx1="http://schemas.microsoft.com/office/drawing/2015/9/8/chartex" xmlns:cx2="http://schemas.microsoft.com/office/drawing/2015/10/21/chartex" xmlns:cx3="http://schemas.microsoft.com/office/drawing/2016/5/9/chartex" xmlns:cx4="http://schemas.microsoft.com/office/drawing/2016/5/10/chartex" xmlns:cx5="http://schemas.microsoft.com/office/drawing/2016/5/11/chartex" xmlns:cx6="http://schemas.microsoft.com/office/drawing/2016/5/12/chartex" xmlns:cx7="http://schemas.microsoft.com/office/drawing/2016/5/13/chartex" xmlns:cx8="http://schemas.microsoft.com/office/drawing/2016/5/14/chartex" xmlns:mc="http://schemas.openxmlformats.org/markup-compatibility/2006" xmlns:aink="http://schemas.microsoft.com/office/drawing/2016/ink" xmlns:am3d="http://schemas.microsoft.com/office/drawing/2017/model3d" xmlns:o="urn:schemas-microsoft-com:office:office" xmlns:oel="http://schemas.microsoft.com/office/2019/extlst" xmlns:r="http://schemas.openxmlformats.org/officeDocument/2006/relationships" xmlns:m="http://schemas.openxmlformats.org/officeDocument/2006/math" xmlns:v="urn:schemas-microsoft-com:vml" xmlns:wp14="http://schemas.microsoft.com/office/word/2010/wordprocessingDrawing" xmlns:wp="http://schemas.openxmlformats.org/drawingml/2006/wordprocessingDrawing" xmlns:w10="urn:schemas-microsoft-com:office:word" xmlns:w="http://schemas.openxmlformats.org/wordprocessingml/2006/main" xmlns:w14="http://schemas.microsoft.com/office/word/2010/wordml" xmlns:w15="http://schemas.microsoft.com/office/word/2012/wordml" xmlns:w16cex="http://schemas.microsoft.com/office/word/2018/wordml/cex" xmlns:w16cid="http://schemas.microsoft.com/office/word/2016/wordml/cid" xmlns:w16="http://schemas.microsoft.com/office/word/2018/wordml" xmlns:w16du="http://schemas.microsoft.com/office/word/2023/wordml/word16du" xmlns:w16sdtdh="http://schemas.microsoft.com/office/word/2020/wordml/sdtdatahash" xmlns:w16sdtfl="http://schemas.microsoft.com/office/word/2024/wordml/sdtformatlock" xmlns:w16se="http://schemas.microsoft.com/office/word/2015/wordml/symex" xmlns:wpg="http://schemas.microsoft.com/office/word/2010/wordprocessingGroup" xmlns:wpi="http://schemas.microsoft.com/office/word/2010/wordprocessingInk" xmlns:wne="http://schemas.microsoft.com/office/word/2006/wordml" xmlns:wps="http://schemas.microsoft.com/office/word/2010/wordprocessingShape" mc:Ignorable="w14 w15 w16se w16cid w16 w16cex w16sdtdh w16sdtfl w16du wp14">
+  <w:abstractNum w:abstractNumId="0" w15:restartNumberingAfterBreak="0">
+    <w:nsid w:val="0A31287D"/>
+    <w:multiLevelType w:val="multilevel"/>
+    <w:tmpl w:val="1C38EDFE"/>
+    <w:lvl w:ilvl="0">
+      <w:start w:val="1"/>
+      <w:numFmt w:val="bullet"/>
+      <w:lvlText w:val=""/>
+      <w:lvlJc w:val="left"/>
+      <w:pPr>
+        <w:tabs>
+          <w:tab w:val="num" w:pos="720"/>
+        </w:tabs>
+        <w:ind w:left="720" w:hanging="360"/>
+      </w:pPr>
+      <w:rPr>
+        <w:rFonts w:ascii="Symbol" w:hAnsi="Symbol" w:hint="default"/>
+        <w:sz w:val="20"/>
+      </w:rPr>
+    </w:lvl>
+    <w:lvl w:ilvl="1" w:tentative="1">
+      <w:start w:val="1"/>
+      <w:numFmt w:val="bullet"/>
+      <w:lvlText w:val="o"/>
+      <w:lvlJc w:val="left"/>
+      <w:pPr>
+        <w:tabs>
+          <w:tab w:val="num" w:pos="1440"/>
+        </w:tabs>
+        <w:ind w:left="1440" w:hanging="360"/>
+      </w:pPr>
+      <w:rPr>
+        <w:rFonts w:ascii="Courier New" w:hAnsi="Courier New" w:hint="default"/>
+        <w:sz w:val="20"/>
+      </w:rPr>
+    </w:lvl>
+    <w:lvl w:ilvl="2" w:tentative="1">
+      <w:start w:val="1"/>
+      <w:numFmt w:val="bullet"/>
+      <w:lvlText w:val=""/>
+      <w:lvlJc w:val="left"/>
+      <w:pPr>
+        <w:tabs>
+          <w:tab w:val="num" w:pos="2160"/>
+        </w:tabs>
+        <w:ind w:left="2160" w:hanging="360"/>
+      </w:pPr>
+      <w:rPr>
+        <w:rFonts w:ascii="Wingdings" w:hAnsi="Wingdings" w:hint="default"/>
+        <w:sz w:val="20"/>
+      </w:rPr>
+    </w:lvl>
+    <w:lvl w:ilvl="3" w:tentative="1">
+      <w:start w:val="1"/>
+      <w:numFmt w:val="bullet"/>
+      <w:lvlText w:val=""/>
+      <w:lvlJc w:val="left"/>
+      <w:pPr>
+        <w:tabs>
+          <w:tab w:val="num" w:pos="2880"/>
+        </w:tabs>
+        <w:ind w:left="2880" w:hanging="360"/>
+      </w:pPr>
+      <w:rPr>
+        <w:rFonts w:ascii="Wingdings" w:hAnsi="Wingdings" w:hint="default"/>
+        <w:sz w:val="20"/>
+      </w:rPr>
+    </w:lvl>
+    <w:lvl w:ilvl="4" w:tentative="1">
+      <w:start w:val="1"/>
+      <w:numFmt w:val="bullet"/>
+      <w:lvlText w:val=""/>
+      <w:lvlJc w:val="left"/>
+      <w:pPr>
+        <w:tabs>
+          <w:tab w:val="num" w:pos="3600"/>
+        </w:tabs>
+        <w:ind w:left="3600" w:hanging="360"/>
+      </w:pPr>
+      <w:rPr>
+        <w:rFonts w:ascii="Wingdings" w:hAnsi="Wingdings" w:hint="default"/>
+        <w:sz w:val="20"/>
+      </w:rPr>
+    </w:lvl>
+    <w:lvl w:ilvl="5" w:tentative="1">
+      <w:start w:val="1"/>
+      <w:numFmt w:val="bullet"/>
+      <w:lvlText w:val=""/>
+      <w:lvlJc w:val="left"/>
+      <w:pPr>
+        <w:tabs>
+          <w:tab w:val="num" w:pos="4320"/>
+        </w:tabs>
+        <w:ind w:left="4320" w:hanging="360"/>
+      </w:pPr>
+      <w:rPr>
+        <w:rFonts w:ascii="Wingdings" w:hAnsi="Wingdings" w:hint="default"/>
+        <w:sz w:val="20"/>
+      </w:rPr>
+    </w:lvl>
+    <w:lvl w:ilvl="6" w:tentative="1">
+      <w:start w:val="1"/>
+      <w:numFmt w:val="bullet"/>
+      <w:lvlText w:val=""/>
+      <w:lvlJc w:val="left"/>
+      <w:pPr>
+        <w:tabs>
+          <w:tab w:val="num" w:pos="5040"/>
+        </w:tabs>
+        <w:ind w:left="5040" w:hanging="360"/>
+      </w:pPr>
+      <w:rPr>
+        <w:rFonts w:ascii="Wingdings" w:hAnsi="Wingdings" w:hint="default"/>
+        <w:sz w:val="20"/>
+      </w:rPr>
+    </w:lvl>
+    <w:lvl w:ilvl="7" w:tentative="1">
+      <w:start w:val="1"/>
+      <w:numFmt w:val="bullet"/>
+      <w:lvlText w:val=""/>
+      <w:lvlJc w:val="left"/>
+      <w:pPr>
+        <w:tabs>
+          <w:tab w:val="num" w:pos="5760"/>
+        </w:tabs>
+        <w:ind w:left="5760" w:hanging="360"/>
+      </w:pPr>
+      <w:rPr>
+        <w:rFonts w:ascii="Wingdings" w:hAnsi="Wingdings" w:hint="default"/>
+        <w:sz w:val="20"/>
+      </w:rPr>
+    </w:lvl>
+    <w:lvl w:ilvl="8" w:tentative="1">
+      <w:start w:val="1"/>
+      <w:numFmt w:val="bullet"/>
+      <w:lvlText w:val=""/>
+      <w:lvlJc w:val="left"/>
+      <w:pPr>
+        <w:tabs>
+          <w:tab w:val="num" w:pos="6480"/>
+        </w:tabs>
+        <w:ind w:left="6480" w:hanging="360"/>
+      </w:pPr>
+      <w:rPr>
+        <w:rFonts w:ascii="Wingdings" w:hAnsi="Wingdings" w:hint="default"/>
+        <w:sz w:val="20"/>
+      </w:rPr>
+    </w:lvl>
+  </w:abstractNum>
+  <w:abstractNum w:abstractNumId="1" w15:restartNumberingAfterBreak="0">
+    <w:nsid w:val="0EDD6657"/>
+    <w:multiLevelType w:val="multilevel"/>
+    <w:tmpl w:val="B6046362"/>
+    <w:lvl w:ilvl="0">
+      <w:start w:val="1"/>
+      <w:numFmt w:val="bullet"/>
+      <w:lvlText w:val=""/>
+      <w:lvlJc w:val="left"/>
+      <w:pPr>
+        <w:tabs>
+          <w:tab w:val="num" w:pos="720"/>
+        </w:tabs>
+        <w:ind w:left="720" w:hanging="360"/>
+      </w:pPr>
+      <w:rPr>
+        <w:rFonts w:ascii="Symbol" w:hAnsi="Symbol" w:hint="default"/>
+        <w:sz w:val="20"/>
+      </w:rPr>
+    </w:lvl>
+    <w:lvl w:ilvl="1" w:tentative="1">
+      <w:start w:val="1"/>
+      <w:numFmt w:val="bullet"/>
+      <w:lvlText w:val="o"/>
+      <w:lvlJc w:val="left"/>
+      <w:pPr>
+        <w:tabs>
+          <w:tab w:val="num" w:pos="1440"/>
+        </w:tabs>
+        <w:ind w:left="1440" w:hanging="360"/>
+      </w:pPr>
+      <w:rPr>
+        <w:rFonts w:ascii="Courier New" w:hAnsi="Courier New" w:hint="default"/>
+        <w:sz w:val="20"/>
+      </w:rPr>
+    </w:lvl>
+    <w:lvl w:ilvl="2" w:tentative="1">
+      <w:start w:val="1"/>
+      <w:numFmt w:val="bullet"/>
+      <w:lvlText w:val=""/>
+      <w:lvlJc w:val="left"/>
+      <w:pPr>
+        <w:tabs>
+          <w:tab w:val="num" w:pos="2160"/>
+        </w:tabs>
+        <w:ind w:left="2160" w:hanging="360"/>
+      </w:pPr>
+      <w:rPr>
+        <w:rFonts w:ascii="Wingdings" w:hAnsi="Wingdings" w:hint="default"/>
+        <w:sz w:val="20"/>
+      </w:rPr>
+    </w:lvl>
+    <w:lvl w:ilvl="3" w:tentative="1">
+      <w:start w:val="1"/>
+      <w:numFmt w:val="bullet"/>
+      <w:lvlText w:val=""/>
+      <w:lvlJc w:val="left"/>
+      <w:pPr>
+        <w:tabs>
+          <w:tab w:val="num" w:pos="2880"/>
+        </w:tabs>
+        <w:ind w:left="2880" w:hanging="360"/>
+      </w:pPr>
+      <w:rPr>
+        <w:rFonts w:ascii="Wingdings" w:hAnsi="Wingdings" w:hint="default"/>
+        <w:sz w:val="20"/>
+      </w:rPr>
+    </w:lvl>
+    <w:lvl w:ilvl="4" w:tentative="1">
+      <w:start w:val="1"/>
+      <w:numFmt w:val="bullet"/>
+      <w:lvlText w:val=""/>
+      <w:lvlJc w:val="left"/>
+      <w:pPr>
+        <w:tabs>
+          <w:tab w:val="num" w:pos="3600"/>
+        </w:tabs>
+        <w:ind w:left="3600" w:hanging="360"/>
+      </w:pPr>
+      <w:rPr>
+        <w:rFonts w:ascii="Wingdings" w:hAnsi="Wingdings" w:hint="default"/>
+        <w:sz w:val="20"/>
+      </w:rPr>
+    </w:lvl>
+    <w:lvl w:ilvl="5" w:tentative="1">
+      <w:start w:val="1"/>
+      <w:numFmt w:val="bullet"/>
+      <w:lvlText w:val=""/>
+      <w:lvlJc w:val="left"/>
+      <w:pPr>
+        <w:tabs>
+          <w:tab w:val="num" w:pos="4320"/>
+        </w:tabs>
+        <w:ind w:left="4320" w:hanging="360"/>
+      </w:pPr>
+      <w:rPr>
+        <w:rFonts w:ascii="Wingdings" w:hAnsi="Wingdings" w:hint="default"/>
+        <w:sz w:val="20"/>
+      </w:rPr>
+    </w:lvl>
+    <w:lvl w:ilvl="6" w:tentative="1">
+      <w:start w:val="1"/>
+      <w:numFmt w:val="bullet"/>
+      <w:lvlText w:val=""/>
+      <w:lvlJc w:val="left"/>
+      <w:pPr>
+        <w:tabs>
+          <w:tab w:val="num" w:pos="5040"/>
+        </w:tabs>
+        <w:ind w:left="5040" w:hanging="360"/>
+      </w:pPr>
+      <w:rPr>
+        <w:rFonts w:ascii="Wingdings" w:hAnsi="Wingdings" w:hint="default"/>
+        <w:sz w:val="20"/>
+      </w:rPr>
+    </w:lvl>
+    <w:lvl w:ilvl="7" w:tentative="1">
+      <w:start w:val="1"/>
+      <w:numFmt w:val="bullet"/>
+      <w:lvlText w:val=""/>
+      <w:lvlJc w:val="left"/>
+      <w:pPr>
+        <w:tabs>
+          <w:tab w:val="num" w:pos="5760"/>
+        </w:tabs>
+        <w:ind w:left="5760" w:hanging="360"/>
+      </w:pPr>
+      <w:rPr>
+        <w:rFonts w:ascii="Wingdings" w:hAnsi="Wingdings" w:hint="default"/>
+        <w:sz w:val="20"/>
+      </w:rPr>
+    </w:lvl>
+    <w:lvl w:ilvl="8" w:tentative="1">
+      <w:start w:val="1"/>
+      <w:numFmt w:val="bullet"/>
+      <w:lvlText w:val=""/>
+      <w:lvlJc w:val="left"/>
+      <w:pPr>
+        <w:tabs>
+          <w:tab w:val="num" w:pos="6480"/>
+        </w:tabs>
+        <w:ind w:left="6480" w:hanging="360"/>
+      </w:pPr>
+      <w:rPr>
+        <w:rFonts w:ascii="Wingdings" w:hAnsi="Wingdings" w:hint="default"/>
+        <w:sz w:val="20"/>
+      </w:rPr>
+    </w:lvl>
+  </w:abstractNum>
+  <w:abstractNum w:abstractNumId="2" w15:restartNumberingAfterBreak="0">
+    <w:nsid w:val="4EC81476"/>
+    <w:multiLevelType w:val="hybridMultilevel"/>
+    <w:tmpl w:val="6EE4BE8C"/>
+    <w:lvl w:ilvl="0" w:tplc="1809000F">
+      <w:start w:val="1"/>
+      <w:numFmt w:val="decimal"/>
+      <w:lvlText w:val="%1."/>
+      <w:lvlJc w:val="left"/>
+      <w:pPr>
+        <w:ind w:left="720" w:hanging="360"/>
+      </w:pPr>
+    </w:lvl>
+    <w:lvl w:ilvl="1" w:tplc="18090019" w:tentative="1">
+      <w:start w:val="1"/>
+      <w:numFmt w:val="lowerLetter"/>
+      <w:lvlText w:val="%2."/>
+      <w:lvlJc w:val="left"/>
+      <w:pPr>
+        <w:ind w:left="1440" w:hanging="360"/>
+      </w:pPr>
+    </w:lvl>
+    <w:lvl w:ilvl="2" w:tplc="1809001B" w:tentative="1">
+      <w:start w:val="1"/>
+      <w:numFmt w:val="lowerRoman"/>
+      <w:lvlText w:val="%3."/>
+      <w:lvlJc w:val="right"/>
+      <w:pPr>
+        <w:ind w:left="2160" w:hanging="180"/>
+      </w:pPr>
+    </w:lvl>
+    <w:lvl w:ilvl="3" w:tplc="1809000F" w:tentative="1">
+      <w:start w:val="1"/>
+      <w:numFmt w:val="decimal"/>
+      <w:lvlText w:val="%4."/>
+      <w:lvlJc w:val="left"/>
+      <w:pPr>
+        <w:ind w:left="2880" w:hanging="360"/>
+      </w:pPr>
+    </w:lvl>
+    <w:lvl w:ilvl="4" w:tplc="18090019" w:tentative="1">
+      <w:start w:val="1"/>
+      <w:numFmt w:val="lowerLetter"/>
+      <w:lvlText w:val="%5."/>
+      <w:lvlJc w:val="left"/>
+      <w:pPr>
+        <w:ind w:left="3600" w:hanging="360"/>
+      </w:pPr>
+    </w:lvl>
+    <w:lvl w:ilvl="5" w:tplc="1809001B" w:tentative="1">
+      <w:start w:val="1"/>
+      <w:numFmt w:val="lowerRoman"/>
+      <w:lvlText w:val="%6."/>
+      <w:lvlJc w:val="right"/>
+      <w:pPr>
+        <w:ind w:left="4320" w:hanging="180"/>
+      </w:pPr>
+    </w:lvl>
+    <w:lvl w:ilvl="6" w:tplc="1809000F" w:tentative="1">
+      <w:start w:val="1"/>
+      <w:numFmt w:val="decimal"/>
+      <w:lvlText w:val="%7."/>
+      <w:lvlJc w:val="left"/>
+      <w:pPr>
+        <w:ind w:left="5040" w:hanging="360"/>
+      </w:pPr>
+    </w:lvl>
+    <w:lvl w:ilvl="7" w:tplc="18090019" w:tentative="1">
+      <w:start w:val="1"/>
+      <w:numFmt w:val="lowerLetter"/>
+      <w:lvlText w:val="%8."/>
+      <w:lvlJc w:val="left"/>
+      <w:pPr>
+        <w:ind w:left="5760" w:hanging="360"/>
+      </w:pPr>
+    </w:lvl>
+    <w:lvl w:ilvl="8" w:tplc="1809001B" w:tentative="1">
+      <w:start w:val="1"/>
+      <w:numFmt w:val="lowerRoman"/>
+      <w:lvlText w:val="%9."/>
+      <w:lvlJc w:val="right"/>
+      <w:pPr>
+        <w:ind w:left="6480" w:hanging="180"/>
+      </w:pPr>
+    </w:lvl>
+  </w:abstractNum>
+  <w:abstractNum w:abstractNumId="3" w15:restartNumberingAfterBreak="0">
+    <w:nsid w:val="5A995D3C"/>
+    <w:multiLevelType w:val="hybridMultilevel"/>
+    <w:tmpl w:val="28CA1E1E"/>
+    <w:lvl w:ilvl="0" w:tplc="18090001">
+      <w:start w:val="1"/>
+      <w:numFmt w:val="bullet"/>
+      <w:lvlText w:val=""/>
+      <w:lvlJc w:val="left"/>
+      <w:pPr>
+        <w:ind w:left="720" w:hanging="360"/>
+      </w:pPr>
+      <w:rPr>
+        <w:rFonts w:ascii="Symbol" w:hAnsi="Symbol" w:hint="default"/>
+      </w:rPr>
+    </w:lvl>
+    <w:lvl w:ilvl="1" w:tplc="18090003" w:tentative="1">
+      <w:start w:val="1"/>
+      <w:numFmt w:val="bullet"/>
+      <w:lvlText w:val="o"/>
+      <w:lvlJc w:val="left"/>
+      <w:pPr>
+        <w:ind w:left="1440" w:hanging="360"/>
+      </w:pPr>
+      <w:rPr>
+        <w:rFonts w:ascii="Courier New" w:hAnsi="Courier New" w:cs="Courier New" w:hint="default"/>
+      </w:rPr>
+    </w:lvl>
+    <w:lvl w:ilvl="2" w:tplc="18090005" w:tentative="1">
+      <w:start w:val="1"/>
+      <w:numFmt w:val="bullet"/>
+      <w:lvlText w:val=""/>
+      <w:lvlJc w:val="left"/>
+      <w:pPr>
+        <w:ind w:left="2160" w:hanging="360"/>
+      </w:pPr>
+      <w:rPr>
+        <w:rFonts w:ascii="Wingdings" w:hAnsi="Wingdings" w:hint="default"/>
+      </w:rPr>
+    </w:lvl>
+    <w:lvl w:ilvl="3" w:tplc="18090001" w:tentative="1">
+      <w:start w:val="1"/>
+      <w:numFmt w:val="bullet"/>
+      <w:lvlText w:val=""/>
+      <w:lvlJc w:val="left"/>
+      <w:pPr>
+        <w:ind w:left="2880" w:hanging="360"/>
+      </w:pPr>
+      <w:rPr>
+        <w:rFonts w:ascii="Symbol" w:hAnsi="Symbol" w:hint="default"/>
+      </w:rPr>
+    </w:lvl>
+    <w:lvl w:ilvl="4" w:tplc="18090003" w:tentative="1">
+      <w:start w:val="1"/>
+      <w:numFmt w:val="bullet"/>
+      <w:lvlText w:val="o"/>
+      <w:lvlJc w:val="left"/>
+      <w:pPr>
+        <w:ind w:left="3600" w:hanging="360"/>
+      </w:pPr>
+      <w:rPr>
+        <w:rFonts w:ascii="Courier New" w:hAnsi="Courier New" w:cs="Courier New" w:hint="default"/>
+      </w:rPr>
+    </w:lvl>
+    <w:lvl w:ilvl="5" w:tplc="18090005" w:tentative="1">
+      <w:start w:val="1"/>
+      <w:numFmt w:val="bullet"/>
+      <w:lvlText w:val=""/>
+      <w:lvlJc w:val="left"/>
+      <w:pPr>
+        <w:ind w:left="4320" w:hanging="360"/>
+      </w:pPr>
+      <w:rPr>
+        <w:rFonts w:ascii="Wingdings" w:hAnsi="Wingdings" w:hint="default"/>
+      </w:rPr>
+    </w:lvl>
+    <w:lvl w:ilvl="6" w:tplc="18090001" w:tentative="1">
+      <w:start w:val="1"/>
+      <w:numFmt w:val="bullet"/>
+      <w:lvlText w:val=""/>
+      <w:lvlJc w:val="left"/>
+      <w:pPr>
+        <w:ind w:left="5040" w:hanging="360"/>
+      </w:pPr>
+      <w:rPr>
+        <w:rFonts w:ascii="Symbol" w:hAnsi="Symbol" w:hint="default"/>
+      </w:rPr>
+    </w:lvl>
+    <w:lvl w:ilvl="7" w:tplc="18090003" w:tentative="1">
+      <w:start w:val="1"/>
+      <w:numFmt w:val="bullet"/>
+      <w:lvlText w:val="o"/>
+      <w:lvlJc w:val="left"/>
+      <w:pPr>
+        <w:ind w:left="5760" w:hanging="360"/>
+      </w:pPr>
+      <w:rPr>
+        <w:rFonts w:ascii="Courier New" w:hAnsi="Courier New" w:cs="Courier New" w:hint="default"/>
+      </w:rPr>
+    </w:lvl>
+    <w:lvl w:ilvl="8" w:tplc="18090005" w:tentative="1">
+      <w:start w:val="1"/>
+      <w:numFmt w:val="bullet"/>
+      <w:lvlText w:val=""/>
+      <w:lvlJc w:val="left"/>
+      <w:pPr>
+        <w:ind w:left="6480" w:hanging="360"/>
+      </w:pPr>
+      <w:rPr>
+        <w:rFonts w:ascii="Wingdings" w:hAnsi="Wingdings" w:hint="default"/>
+      </w:rPr>
+    </w:lvl>
+  </w:abstractNum>
+  <w:abstractNum w:abstractNumId="4" w15:restartNumberingAfterBreak="0">
+    <w:nsid w:val="66756AD0"/>
+    <w:multiLevelType w:val="hybridMultilevel"/>
+    <w:tmpl w:val="D472C934"/>
+    <w:lvl w:ilvl="0" w:tplc="18090001">
+      <w:start w:val="1"/>
+      <w:numFmt w:val="bullet"/>
+      <w:lvlText w:val=""/>
+      <w:lvlJc w:val="left"/>
+      <w:pPr>
+        <w:ind w:left="720" w:hanging="360"/>
+      </w:pPr>
+      <w:rPr>
+        <w:rFonts w:ascii="Symbol" w:hAnsi="Symbol" w:hint="default"/>
+      </w:rPr>
+    </w:lvl>
+    <w:lvl w:ilvl="1" w:tplc="18090003" w:tentative="1">
+      <w:start w:val="1"/>
+      <w:numFmt w:val="bullet"/>
+      <w:lvlText w:val="o"/>
+      <w:lvlJc w:val="left"/>
+      <w:pPr>
+        <w:ind w:left="1440" w:hanging="360"/>
+      </w:pPr>
+      <w:rPr>
+        <w:rFonts w:ascii="Courier New" w:hAnsi="Courier New" w:cs="Courier New" w:hint="default"/>
+      </w:rPr>
+    </w:lvl>
+    <w:lvl w:ilvl="2" w:tplc="18090005" w:tentative="1">
+      <w:start w:val="1"/>
+      <w:numFmt w:val="bullet"/>
+      <w:lvlText w:val=""/>
+      <w:lvlJc w:val="left"/>
+      <w:pPr>
+        <w:ind w:left="2160" w:hanging="360"/>
+      </w:pPr>
+      <w:rPr>
+        <w:rFonts w:ascii="Wingdings" w:hAnsi="Wingdings" w:hint="default"/>
+      </w:rPr>
+    </w:lvl>
+    <w:lvl w:ilvl="3" w:tplc="18090001" w:tentative="1">
+      <w:start w:val="1"/>
+      <w:numFmt w:val="bullet"/>
+      <w:lvlText w:val=""/>
+      <w:lvlJc w:val="left"/>
+      <w:pPr>
+        <w:ind w:left="2880" w:hanging="360"/>
+      </w:pPr>
+      <w:rPr>
+        <w:rFonts w:ascii="Symbol" w:hAnsi="Symbol" w:hint="default"/>
+      </w:rPr>
+    </w:lvl>
+    <w:lvl w:ilvl="4" w:tplc="18090003" w:tentative="1">
+      <w:start w:val="1"/>
+      <w:numFmt w:val="bullet"/>
+      <w:lvlText w:val="o"/>
+      <w:lvlJc w:val="left"/>
+      <w:pPr>
+        <w:ind w:left="3600" w:hanging="360"/>
+      </w:pPr>
+      <w:rPr>
+        <w:rFonts w:ascii="Courier New" w:hAnsi="Courier New" w:cs="Courier New" w:hint="default"/>
+      </w:rPr>
+    </w:lvl>
+    <w:lvl w:ilvl="5" w:tplc="18090005" w:tentative="1">
+      <w:start w:val="1"/>
+      <w:numFmt w:val="bullet"/>
+      <w:lvlText w:val=""/>
+      <w:lvlJc w:val="left"/>
+      <w:pPr>
+        <w:ind w:left="4320" w:hanging="360"/>
+      </w:pPr>
+      <w:rPr>
+        <w:rFonts w:ascii="Wingdings" w:hAnsi="Wingdings" w:hint="default"/>
+      </w:rPr>
+    </w:lvl>
+    <w:lvl w:ilvl="6" w:tplc="18090001" w:tentative="1">
+      <w:start w:val="1"/>
+      <w:numFmt w:val="bullet"/>
+      <w:lvlText w:val=""/>
+      <w:lvlJc w:val="left"/>
+      <w:pPr>
+        <w:ind w:left="5040" w:hanging="360"/>
+      </w:pPr>
+      <w:rPr>
+        <w:rFonts w:ascii="Symbol" w:hAnsi="Symbol" w:hint="default"/>
+      </w:rPr>
+    </w:lvl>
+    <w:lvl w:ilvl="7" w:tplc="18090003" w:tentative="1">
+      <w:start w:val="1"/>
+      <w:numFmt w:val="bullet"/>
+      <w:lvlText w:val="o"/>
+      <w:lvlJc w:val="left"/>
+      <w:pPr>
+        <w:ind w:left="5760" w:hanging="360"/>
+      </w:pPr>
+      <w:rPr>
+        <w:rFonts w:ascii="Courier New" w:hAnsi="Courier New" w:cs="Courier New" w:hint="default"/>
+      </w:rPr>
+    </w:lvl>
+    <w:lvl w:ilvl="8" w:tplc="18090005" w:tentative="1">
+      <w:start w:val="1"/>
+      <w:numFmt w:val="bullet"/>
+      <w:lvlText w:val=""/>
+      <w:lvlJc w:val="left"/>
+      <w:pPr>
+        <w:ind w:left="6480" w:hanging="360"/>
+      </w:pPr>
+      <w:rPr>
+        <w:rFonts w:ascii="Wingdings" w:hAnsi="Wingdings" w:hint="default"/>
+      </w:rPr>
+    </w:lvl>
+  </w:abstractNum>
+  <w:abstractNum w:abstractNumId="5" w15:restartNumberingAfterBreak="0">
+    <w:nsid w:val="6AA80726"/>
+    <w:multiLevelType w:val="multilevel"/>
+    <w:tmpl w:val="F1D89F68"/>
+    <w:lvl w:ilvl="0">
+      <w:start w:val="1"/>
+      <w:numFmt w:val="decimal"/>
+      <w:lvlText w:val="%1."/>
+      <w:lvlJc w:val="left"/>
+      <w:pPr>
+        <w:tabs>
+          <w:tab w:val="num" w:pos="720"/>
+        </w:tabs>
+        <w:ind w:left="720" w:hanging="360"/>
+      </w:pPr>
+    </w:lvl>
+    <w:lvl w:ilvl="1" w:tentative="1">
+      <w:start w:val="1"/>
+      <w:numFmt w:val="decimal"/>
+      <w:lvlText w:val="%2."/>
+      <w:lvlJc w:val="left"/>
+      <w:pPr>
+        <w:tabs>
+          <w:tab w:val="num" w:pos="1440"/>
+        </w:tabs>
+        <w:ind w:left="1440" w:hanging="360"/>
+      </w:pPr>
+    </w:lvl>
+    <w:lvl w:ilvl="2" w:tentative="1">
+      <w:start w:val="1"/>
+      <w:numFmt w:val="decimal"/>
+      <w:lvlText w:val="%3."/>
+      <w:lvlJc w:val="left"/>
+      <w:pPr>
+        <w:tabs>
+          <w:tab w:val="num" w:pos="2160"/>
+        </w:tabs>
+        <w:ind w:left="2160" w:hanging="360"/>
+      </w:pPr>
+    </w:lvl>
+    <w:lvl w:ilvl="3" w:tentative="1">
+      <w:start w:val="1"/>
+      <w:numFmt w:val="decimal"/>
+      <w:lvlText w:val="%4."/>
+      <w:lvlJc w:val="left"/>
+      <w:pPr>
+        <w:tabs>
+          <w:tab w:val="num" w:pos="2880"/>
+        </w:tabs>
+        <w:ind w:left="2880" w:hanging="360"/>
+      </w:pPr>
+    </w:lvl>
+    <w:lvl w:ilvl="4" w:tentative="1">
+      <w:start w:val="1"/>
+      <w:numFmt w:val="decimal"/>
+      <w:lvlText w:val="%5."/>
+      <w:lvlJc w:val="left"/>
+      <w:pPr>
+        <w:tabs>
+          <w:tab w:val="num" w:pos="3600"/>
+        </w:tabs>
+        <w:ind w:left="3600" w:hanging="360"/>
+      </w:pPr>
+    </w:lvl>
+    <w:lvl w:ilvl="5" w:tentative="1">
+      <w:start w:val="1"/>
+      <w:numFmt w:val="decimal"/>
+      <w:lvlText w:val="%6."/>
+      <w:lvlJc w:val="left"/>
+      <w:pPr>
+        <w:tabs>
+          <w:tab w:val="num" w:pos="4320"/>
+        </w:tabs>
+        <w:ind w:left="4320" w:hanging="360"/>
+      </w:pPr>
+    </w:lvl>
+    <w:lvl w:ilvl="6" w:tentative="1">
+      <w:start w:val="1"/>
+      <w:numFmt w:val="decimal"/>
+      <w:lvlText w:val="%7."/>
+      <w:lvlJc w:val="left"/>
+      <w:pPr>
+        <w:tabs>
+          <w:tab w:val="num" w:pos="5040"/>
+        </w:tabs>
+        <w:ind w:left="5040" w:hanging="360"/>
+      </w:pPr>
+    </w:lvl>
+    <w:lvl w:ilvl="7" w:tentative="1">
+      <w:start w:val="1"/>
+      <w:numFmt w:val="decimal"/>
+      <w:lvlText w:val="%8."/>
+      <w:lvlJc w:val="left"/>
+      <w:pPr>
+        <w:tabs>
+          <w:tab w:val="num" w:pos="5760"/>
+        </w:tabs>
+        <w:ind w:left="5760" w:hanging="360"/>
+      </w:pPr>
+    </w:lvl>
+    <w:lvl w:ilvl="8" w:tentative="1">
+      <w:start w:val="1"/>
+      <w:numFmt w:val="decimal"/>
+      <w:lvlText w:val="%9."/>
+      <w:lvlJc w:val="left"/>
+      <w:pPr>
+        <w:tabs>
+          <w:tab w:val="num" w:pos="6480"/>
+        </w:tabs>
+        <w:ind w:left="6480" w:hanging="360"/>
+      </w:pPr>
+    </w:lvl>
+  </w:abstractNum>
+  <w:num w:numId="1" w16cid:durableId="1749884429">
+    <w:abstractNumId w:val="5"/>
+  </w:num>
+  <w:num w:numId="2" w16cid:durableId="1947030837">
+    <w:abstractNumId w:val="0"/>
+  </w:num>
+  <w:num w:numId="3" w16cid:durableId="141896763">
+    <w:abstractNumId w:val="1"/>
+  </w:num>
+  <w:num w:numId="4" w16cid:durableId="353849327">
+    <w:abstractNumId w:val="2"/>
+  </w:num>
+  <w:num w:numId="5" w16cid:durableId="2011105829">
+    <w:abstractNumId w:val="3"/>
+  </w:num>
+  <w:num w:numId="6" w16cid:durableId="1100174260">
+    <w:abstractNumId w:val="4"/>
+  </w:num>
+</w:numbering>
 </file>
 
 <file path=word/styles.xml><?xml version="1.0" encoding="utf-8"?>
@@ -644,7 +2152,6 @@
   <w:style w:type="character" w:default="1" w:styleId="DefaultParagraphFont">
     <w:name w:val="Default Paragraph Font"/>
     <w:uiPriority w:val="1"/>
-    <w:semiHidden/>
     <w:unhideWhenUsed/>
   </w:style>
   <w:style w:type="table" w:default="1" w:styleId="TableNormal">
@@ -956,6 +2463,29 @@
       <w:smallCaps/>
       <w:color w:val="0F4761" w:themeColor="accent1" w:themeShade="BF"/>
       <w:spacing w:val="5"/>
+    </w:rPr>
+  </w:style>
+  <w:style w:type="character" w:styleId="Hyperlink">
+    <w:name w:val="Hyperlink"/>
+    <w:basedOn w:val="DefaultParagraphFont"/>
+    <w:uiPriority w:val="99"/>
+    <w:unhideWhenUsed/>
+    <w:rsid w:val="004578B5"/>
+    <w:rPr>
+      <w:color w:val="467886" w:themeColor="hyperlink"/>
+      <w:u w:val="single"/>
+    </w:rPr>
+  </w:style>
+  <w:style w:type="character" w:styleId="UnresolvedMention">
+    <w:name w:val="Unresolved Mention"/>
+    <w:basedOn w:val="DefaultParagraphFont"/>
+    <w:uiPriority w:val="99"/>
+    <w:semiHidden/>
+    <w:unhideWhenUsed/>
+    <w:rsid w:val="004578B5"/>
+    <w:rPr>
+      <w:color w:val="605E5C"/>
+      <w:shd w:val="clear" w:color="auto" w:fill="E1DFDD"/>
     </w:rPr>
   </w:style>
 </w:styles>
@@ -1274,4 +2804,16 @@
     </a:ext>
   </a:extLst>
 </a:theme>
+</file>
+
+<file path=customXml/item1.xml><?xml version="1.0" encoding="utf-8"?>
+<b:Sources xmlns:b="http://schemas.openxmlformats.org/officeDocument/2006/bibliography" xmlns="http://schemas.openxmlformats.org/officeDocument/2006/bibliography" SelectedStyle="\APASixthEditionOfficeOnline.xsl" StyleName="APA" Version="6"/>
+</file>
+
+<file path=customXml/itemProps1.xml><?xml version="1.0" encoding="utf-8"?>
+<ds:datastoreItem xmlns:ds="http://schemas.openxmlformats.org/officeDocument/2006/customXml" ds:itemID="{02F4445D-3317-462A-91C2-C7F51810E93B}">
+  <ds:schemaRefs>
+    <ds:schemaRef ds:uri="http://schemas.openxmlformats.org/officeDocument/2006/bibliography"/>
+  </ds:schemaRefs>
+</ds:datastoreItem>
 </file>
</xml_diff>

<commit_message>
updates and added SA&DA
</commit_message>
<xml_diff>
--- a/Topic Pitch.docx
+++ b/Topic Pitch.docx
@@ -24,7 +24,7 @@
           <w:szCs w:val="28"/>
           <w:lang w:val="en-GB"/>
         </w:rPr>
-        <w:t>An Investigation on Connections between Exercise and Physical and Mental Health</w:t>
+        <w:t xml:space="preserve">An Investigation on Connections between </w:t>
       </w:r>
       <w:r>
         <w:rPr>
@@ -35,7 +35,18 @@
           <w:szCs w:val="28"/>
           <w:lang w:val="en-GB"/>
         </w:rPr>
-        <w:t xml:space="preserve"> – Topic Pitch</w:t>
+        <w:t xml:space="preserve">General and Exercise Activity Levels </w:t>
+      </w:r>
+      <w:r>
+        <w:rPr>
+          <w:rFonts w:ascii="Arial" w:hAnsi="Arial" w:cs="Arial"/>
+          <w:b/>
+          <w:bCs/>
+          <w:sz w:val="28"/>
+          <w:szCs w:val="28"/>
+          <w:lang w:val="en-GB"/>
+        </w:rPr>
+        <w:t>– Topic Pitch</w:t>
       </w:r>
     </w:p>
     <w:p>
@@ -51,7 +62,28 @@
           <w:rFonts w:ascii="Arial" w:hAnsi="Arial" w:cs="Arial"/>
           <w:lang w:val="en-GB"/>
         </w:rPr>
-        <w:t>This project is focused on investigating the links between activity level and various health markers.</w:t>
+        <w:t xml:space="preserve">This project is focused on investigating the links between </w:t>
+      </w:r>
+      <w:r>
+        <w:rPr>
+          <w:rFonts w:ascii="Arial" w:hAnsi="Arial" w:cs="Arial"/>
+          <w:lang w:val="en-GB"/>
+        </w:rPr>
+        <w:t xml:space="preserve">general </w:t>
+      </w:r>
+      <w:r>
+        <w:rPr>
+          <w:rFonts w:ascii="Arial" w:hAnsi="Arial" w:cs="Arial"/>
+          <w:lang w:val="en-GB"/>
+        </w:rPr>
+        <w:t xml:space="preserve">activity level and </w:t>
+      </w:r>
+      <w:r>
+        <w:rPr>
+          <w:rFonts w:ascii="Arial" w:hAnsi="Arial" w:cs="Arial"/>
+          <w:lang w:val="en-GB"/>
+        </w:rPr>
+        <w:t>physical activity level.</w:t>
       </w:r>
     </w:p>
     <w:p>
@@ -90,84 +122,21 @@
           <w:rFonts w:ascii="Arial" w:hAnsi="Arial" w:cs="Arial"/>
           <w:lang w:val="en-GB"/>
         </w:rPr>
-        <w:t xml:space="preserve">which areas they can focus on. They can see which advertised routines might not have results that match up to what's promised. </w:t>
-      </w:r>
-      <w:r>
-        <w:rPr>
-          <w:rFonts w:ascii="Arial" w:hAnsi="Arial" w:cs="Arial"/>
-          <w:lang w:val="en-GB"/>
-        </w:rPr>
-        <w:t>This data can</w:t>
-      </w:r>
-      <w:r>
-        <w:rPr>
-          <w:rFonts w:ascii="Arial" w:hAnsi="Arial" w:cs="Arial"/>
-          <w:lang w:val="en-GB"/>
-        </w:rPr>
-        <w:t xml:space="preserve"> help people with mental </w:t>
-      </w:r>
-      <w:r>
-        <w:rPr>
-          <w:rFonts w:ascii="Arial" w:hAnsi="Arial" w:cs="Arial"/>
-          <w:lang w:val="en-GB"/>
-        </w:rPr>
-        <w:t>health-based</w:t>
-      </w:r>
-      <w:r>
-        <w:rPr>
-          <w:rFonts w:ascii="Arial" w:hAnsi="Arial" w:cs="Arial"/>
-          <w:lang w:val="en-GB"/>
-        </w:rPr>
-        <w:t xml:space="preserve"> activity. It also </w:t>
-      </w:r>
-      <w:r>
-        <w:rPr>
-          <w:rFonts w:ascii="Arial" w:hAnsi="Arial" w:cs="Arial"/>
-          <w:lang w:val="en-GB"/>
-        </w:rPr>
-        <w:t>better informs people of</w:t>
-      </w:r>
-      <w:r>
-        <w:rPr>
-          <w:rFonts w:ascii="Arial" w:hAnsi="Arial" w:cs="Arial"/>
-          <w:lang w:val="en-GB"/>
-        </w:rPr>
-        <w:t xml:space="preserve"> the timeline </w:t>
-      </w:r>
-      <w:r>
-        <w:rPr>
-          <w:rFonts w:ascii="Arial" w:hAnsi="Arial" w:cs="Arial"/>
-          <w:lang w:val="en-GB"/>
-        </w:rPr>
-        <w:t>to achieve</w:t>
-      </w:r>
-      <w:r>
-        <w:rPr>
-          <w:rFonts w:ascii="Arial" w:hAnsi="Arial" w:cs="Arial"/>
-          <w:lang w:val="en-GB"/>
-        </w:rPr>
-        <w:t xml:space="preserve"> </w:t>
-      </w:r>
-      <w:r>
-        <w:rPr>
-          <w:rFonts w:ascii="Arial" w:hAnsi="Arial" w:cs="Arial"/>
-          <w:lang w:val="en-GB"/>
-        </w:rPr>
-        <w:t>their</w:t>
-      </w:r>
-      <w:r>
-        <w:rPr>
-          <w:rFonts w:ascii="Arial" w:hAnsi="Arial" w:cs="Arial"/>
-          <w:lang w:val="en-GB"/>
-        </w:rPr>
-        <w:t xml:space="preserve"> goals, </w:t>
-      </w:r>
-      <w:r>
-        <w:rPr>
-          <w:rFonts w:ascii="Arial" w:hAnsi="Arial" w:cs="Arial"/>
-          <w:lang w:val="en-GB"/>
-        </w:rPr>
-        <w:t xml:space="preserve">so they don’t give up early. </w:t>
+        <w:t>what may be achievable goals</w:t>
+      </w:r>
+      <w:r>
+        <w:rPr>
+          <w:rFonts w:ascii="Arial" w:hAnsi="Arial" w:cs="Arial"/>
+          <w:lang w:val="en-GB"/>
+        </w:rPr>
+        <w:t>. They can</w:t>
+      </w:r>
+      <w:r>
+        <w:rPr>
+          <w:rFonts w:ascii="Arial" w:hAnsi="Arial" w:cs="Arial"/>
+          <w:lang w:val="en-GB"/>
+        </w:rPr>
+        <w:t xml:space="preserve"> also evaluate their position in comparison to others in with similar activity levels and those with the activity levels that they may be aiming to achieve. This information may also aid public health organisations and health-related providers tailer advise and goals for their clients. The visualization of this data and its context may help providers understand what areas they can target for improvement and what are some reasonable targets to have in place. </w:t>
       </w:r>
       <w:r>
         <w:rPr>
@@ -255,7 +224,14 @@
           <w:rFonts w:ascii="Arial" w:hAnsi="Arial" w:cs="Arial"/>
           <w:lang w:val="en-GB"/>
         </w:rPr>
-        <w:t>What are, if any, the impacts of exercise on the health of sedentary populations?</w:t>
+        <w:t>How much time do those who engage in physical activity spend at various levels of intensity</w:t>
+      </w:r>
+      <w:r>
+        <w:rPr>
+          <w:rFonts w:ascii="Arial" w:hAnsi="Arial" w:cs="Arial"/>
+          <w:lang w:val="en-GB"/>
+        </w:rPr>
+        <w:t>?</w:t>
       </w:r>
     </w:p>
     <w:p>
@@ -276,7 +252,14 @@
           <w:rFonts w:ascii="Arial" w:hAnsi="Arial" w:cs="Arial"/>
           <w:lang w:val="en-GB"/>
         </w:rPr>
-        <w:t>What are, if any, the impacts of exercise on mental health?</w:t>
+        <w:t>How many people engage in a sedentary versus a non-sedentary lifestyle</w:t>
+      </w:r>
+      <w:r>
+        <w:rPr>
+          <w:rFonts w:ascii="Arial" w:hAnsi="Arial" w:cs="Arial"/>
+          <w:lang w:val="en-GB"/>
+        </w:rPr>
+        <w:t>?</w:t>
       </w:r>
     </w:p>
     <w:p>
@@ -297,7 +280,35 @@
           <w:rFonts w:ascii="Arial" w:hAnsi="Arial" w:cs="Arial"/>
           <w:lang w:val="en-GB"/>
         </w:rPr>
-        <w:t>What is, if exists, the relationship between exercise amounts/ intensity and sleep quality?</w:t>
+        <w:t>What</w:t>
+      </w:r>
+      <w:r>
+        <w:rPr>
+          <w:rFonts w:ascii="Arial" w:hAnsi="Arial" w:cs="Arial"/>
+          <w:lang w:val="en-GB"/>
+        </w:rPr>
+        <w:t xml:space="preserve"> is</w:t>
+      </w:r>
+      <w:r>
+        <w:rPr>
+          <w:rFonts w:ascii="Arial" w:hAnsi="Arial" w:cs="Arial"/>
+          <w:lang w:val="en-GB"/>
+        </w:rPr>
+        <w:t xml:space="preserve"> the relationship between exercise </w:t>
+      </w:r>
+      <w:r>
+        <w:rPr>
+          <w:rFonts w:ascii="Arial" w:hAnsi="Arial" w:cs="Arial"/>
+          <w:lang w:val="en-GB"/>
+        </w:rPr>
+        <w:t>intensity and time spent sitting</w:t>
+      </w:r>
+      <w:r>
+        <w:rPr>
+          <w:rFonts w:ascii="Arial" w:hAnsi="Arial" w:cs="Arial"/>
+          <w:lang w:val="en-GB"/>
+        </w:rPr>
+        <w:t>?</w:t>
       </w:r>
     </w:p>
     <w:p>
@@ -368,7 +379,21 @@
           <w:rFonts w:ascii="Arial" w:hAnsi="Arial" w:cs="Arial"/>
           <w:lang w:val="en-GB"/>
         </w:rPr>
-        <w:t>Cost-effectiveness of health coaching and financial incentives to promote physical activity after total knee replacement - ScienceDirect</w:t>
+        <w:t xml:space="preserve">Interplay between physical activity volume and intensity with modelled life expectancy in women and men: A prospective cohort analysis </w:t>
+      </w:r>
+      <w:r>
+        <w:rPr>
+          <w:rFonts w:ascii="Arial" w:hAnsi="Arial" w:cs="Arial"/>
+          <w:lang w:val="en-GB"/>
+        </w:rPr>
+        <w:t>–</w:t>
+      </w:r>
+      <w:r>
+        <w:rPr>
+          <w:rFonts w:ascii="Arial" w:hAnsi="Arial" w:cs="Arial"/>
+          <w:lang w:val="en-GB"/>
+        </w:rPr>
+        <w:t xml:space="preserve"> ScienceDirect</w:t>
       </w:r>
     </w:p>
     <w:p>
@@ -389,49 +414,7 @@
           <w:rFonts w:ascii="Arial" w:hAnsi="Arial" w:cs="Arial"/>
           <w:lang w:val="en-GB"/>
         </w:rPr>
-        <w:t>An international consensus on strategies for implementing physical activity in inpatient mental health services: A nominal group technique - ScienceDirect</w:t>
-      </w:r>
-    </w:p>
-    <w:p>
-      <w:pPr>
-        <w:pStyle w:val="ListParagraph"/>
-        <w:numPr>
-          <w:ilvl w:val="0"/>
-          <w:numId w:val="5"/>
-        </w:numPr>
-        <w:spacing w:after="0"/>
-        <w:rPr>
-          <w:rFonts w:ascii="Arial" w:hAnsi="Arial" w:cs="Arial"/>
-          <w:lang w:val="en-GB"/>
-        </w:rPr>
-      </w:pPr>
-      <w:r>
-        <w:rPr>
-          <w:rFonts w:ascii="Arial" w:hAnsi="Arial" w:cs="Arial"/>
-          <w:lang w:val="en-GB"/>
-        </w:rPr>
-        <w:t>Mental health and sleep quality across different physical activity intensities: A cross-sectional epidemiological analysis - ScienceDirect</w:t>
-      </w:r>
-    </w:p>
-    <w:p>
-      <w:pPr>
-        <w:pStyle w:val="ListParagraph"/>
-        <w:numPr>
-          <w:ilvl w:val="0"/>
-          <w:numId w:val="5"/>
-        </w:numPr>
-        <w:spacing w:after="0"/>
-        <w:rPr>
-          <w:rFonts w:ascii="Arial" w:hAnsi="Arial" w:cs="Arial"/>
-          <w:lang w:val="en-GB"/>
-        </w:rPr>
-      </w:pPr>
-      <w:r>
-        <w:rPr>
-          <w:rFonts w:ascii="Arial" w:hAnsi="Arial" w:cs="Arial"/>
-          <w:lang w:val="en-GB"/>
-        </w:rPr>
-        <w:t>Interplay between physical activity volume and intensity with modelled life expectancy in women and men: A prospective cohort analysis - ScienceDirect</w:t>
+        <w:t>National Health and Nutrition Examination Survey (NHANES), collected in 2023 and published in 2024 – The CDC</w:t>
       </w:r>
     </w:p>
     <w:p>

</xml_diff>